<commit_message>
Simplify Walker opening: remove dissertation defense details from intro
Co-Authored-By: Claude Sonnet 4.6 <noreply@anthropic.com>
</commit_message>
<xml_diff>
--- a/application/recommendation_letter_walker.docx
+++ b/application/recommendation_letter_walker.docx
@@ -114,7 +114,7 @@
         <w:t xml:space="preserve"> </w:t>
       </w:r>
       <w:r>
-        <w:t xml:space="preserve">Talents Programme, and as a direct research collaborator. We are co-authors on a</w:t>
+        <w:t xml:space="preserve">Talents Programme, and as a direct research collaborator — we are co-authors on a</w:t>
       </w:r>
       <w:r>
         <w:t xml:space="preserve"> </w:t>
@@ -136,37 +136,19 @@
         <w:t xml:space="preserve"> </w:t>
       </w:r>
       <w:r>
-        <w:t xml:space="preserve">(2022, SSCI Q1), and through</w:t>
-      </w:r>
-      <w:r>
-        <w:t xml:space="preserve"> </w:t>
-      </w:r>
-      <w:r>
-        <w:t xml:space="preserve">both the supervisory relationship and that collaboration I have had the opportunity</w:t>
-      </w:r>
-      <w:r>
-        <w:t xml:space="preserve"> </w:t>
-      </w:r>
-      <w:r>
-        <w:t xml:space="preserve">to observe her as a scholar across multiple dimensions of her work — from the</w:t>
-      </w:r>
-      <w:r>
-        <w:t xml:space="preserve"> </w:t>
-      </w:r>
-      <w:r>
-        <w:t xml:space="preserve">conceptualisation and execution of independent research to the rigorous development</w:t>
-      </w:r>
-      <w:r>
-        <w:t xml:space="preserve"> </w:t>
-      </w:r>
-      <w:r>
-        <w:t xml:space="preserve">of her doctoral dissertation, which passed blind external review and is scheduled for</w:t>
-      </w:r>
-      <w:r>
-        <w:t xml:space="preserve"> </w:t>
-      </w:r>
-      <w:r>
-        <w:t xml:space="preserve">defense in May 2026. I recommend her with confidence and without qualification.</w:t>
+        <w:t xml:space="preserve">(2022, SSCI Q1). Through both</w:t>
+      </w:r>
+      <w:r>
+        <w:t xml:space="preserve"> </w:t>
+      </w:r>
+      <w:r>
+        <w:t xml:space="preserve">relationships I have had ample opportunity to observe her as a scholar, and I</w:t>
+      </w:r>
+      <w:r>
+        <w:t xml:space="preserve"> </w:t>
+      </w:r>
+      <w:r>
+        <w:t xml:space="preserve">recommend her with confidence and without qualification.</w:t>
       </w:r>
     </w:p>
     <w:p>

</xml_diff>

<commit_message>
Recompile Walker rec letter from latest remote version
Co-Authored-By: Claude Sonnet 4.6 <noreply@anthropic.com>
</commit_message>
<xml_diff>
--- a/application/recommendation_letter_walker.docx
+++ b/application/recommendation_letter_walker.docx
@@ -174,43 +174,31 @@
         <w:t xml:space="preserve"> </w:t>
       </w:r>
       <w:r>
-        <w:t xml:space="preserve">was Mengnan’s project in origin and in execution. The central</w:t>
-      </w:r>
-      <w:r>
-        <w:t xml:space="preserve"> </w:t>
-      </w:r>
-      <w:r>
-        <w:t xml:space="preserve">argument — that middle-class attributions of poverty to laziness and moral failing</w:t>
-      </w:r>
-      <w:r>
-        <w:t xml:space="preserve"> </w:t>
-      </w:r>
-      <w:r>
-        <w:t xml:space="preserve">are not simply ideological prejudice but are shaped by personality traits,</w:t>
-      </w:r>
-      <w:r>
-        <w:t xml:space="preserve"> </w:t>
-      </w:r>
-      <w:r>
-        <w:t xml:space="preserve">socialisation, and faith in state policy — required her to build an original survey</w:t>
-      </w:r>
-      <w:r>
-        <w:t xml:space="preserve"> </w:t>
-      </w:r>
-      <w:r>
-        <w:t xml:space="preserve">instrument, collect data from 2,449 middle-class respondents, and apply binomial and</w:t>
-      </w:r>
-      <w:r>
-        <w:t xml:space="preserve"> </w:t>
-      </w:r>
-      <w:r>
-        <w:t xml:space="preserve">multinomial logistic regression to relate poverty attribution patterns to</w:t>
-      </w:r>
-      <w:r>
-        <w:t xml:space="preserve"> </w:t>
-      </w:r>
-      <w:r>
-        <w:t xml:space="preserve">psychological and sociological predictors. The analysis is technically rigorous, but</w:t>
+        <w:t xml:space="preserve">draws on survey data from a research programme on poverty</w:t>
+      </w:r>
+      <w:r>
+        <w:t xml:space="preserve"> </w:t>
+      </w:r>
+      <w:r>
+        <w:t xml:space="preserve">perceptions and moral stigma in China, and Mengnan was involved across the full arc</w:t>
+      </w:r>
+      <w:r>
+        <w:t xml:space="preserve"> </w:t>
+      </w:r>
+      <w:r>
+        <w:t xml:space="preserve">of the project — from questionnaire design and data collection through to the quantitative analysis. She applied binomial and multinomial</w:t>
+      </w:r>
+      <w:r>
+        <w:t xml:space="preserve"> </w:t>
+      </w:r>
+      <w:r>
+        <w:t xml:space="preserve">logistic regression to relate poverty attribution patterns to psychological,</w:t>
+      </w:r>
+      <w:r>
+        <w:t xml:space="preserve"> </w:t>
+      </w:r>
+      <w:r>
+        <w:t xml:space="preserve">sociological, and policy-related predictors. The analysis is technically rigorous, but</w:t>
       </w:r>
       <w:r>
         <w:t xml:space="preserve"> </w:t>
@@ -248,61 +236,127 @@
         <w:pStyle w:val="BodyText"/>
       </w:pPr>
       <w:r>
-        <w:t xml:space="preserve">My own research on poverty and shame in China and globally has convinced me that the</w:t>
-      </w:r>
-      <w:r>
-        <w:t xml:space="preserve"> </w:t>
-      </w:r>
-      <w:r>
-        <w:t xml:space="preserve">ideational and the institutional dimensions of anti-poverty governance are</w:t>
-      </w:r>
-      <w:r>
-        <w:t xml:space="preserve"> </w:t>
-      </w:r>
-      <w:r>
-        <w:t xml:space="preserve">inseparable: how the poor are perceived by those not in poverty shapes the political</w:t>
-      </w:r>
-      <w:r>
-        <w:t xml:space="preserve"> </w:t>
-      </w:r>
-      <w:r>
-        <w:t xml:space="preserve">space for policy design as much as any institutional or fiscal variable. Mengnan</w:t>
-      </w:r>
-      <w:r>
-        <w:t xml:space="preserve"> </w:t>
-      </w:r>
-      <w:r>
-        <w:t xml:space="preserve">grasps this. Her paper addresses the ideational conditions under which China’s</w:t>
-      </w:r>
-      <w:r>
-        <w:t xml:space="preserve"> </w:t>
-      </w:r>
-      <w:r>
-        <w:t xml:space="preserve">transition from targeted poverty alleviation to relative poverty reduction becomes</w:t>
-      </w:r>
-      <w:r>
-        <w:t xml:space="preserve"> </w:t>
-      </w:r>
-      <w:r>
-        <w:t xml:space="preserve">politically feasible or contested. In doing so, it connects to the largest questions</w:t>
-      </w:r>
-      <w:r>
-        <w:t xml:space="preserve"> </w:t>
-      </w:r>
-      <w:r>
-        <w:t xml:space="preserve">in Chinese political economy: how the party-state manages legitimacy through</w:t>
-      </w:r>
-      <w:r>
-        <w:t xml:space="preserve"> </w:t>
-      </w:r>
-      <w:r>
-        <w:t xml:space="preserve">redistributive commitments, and what the middle class will tolerate. These are</w:t>
-      </w:r>
-      <w:r>
-        <w:t xml:space="preserve"> </w:t>
-      </w:r>
-      <w:r>
-        <w:t xml:space="preserve">questions at the heart of the research agenda that CCCW is built to address.</w:t>
+        <w:t xml:space="preserve">My supervisory relationship with Mengnan has given me a vantage point that extends</w:t>
+      </w:r>
+      <w:r>
+        <w:t xml:space="preserve"> </w:t>
+      </w:r>
+      <w:r>
+        <w:t xml:space="preserve">beyond the published work. What I have observed over the arc of her doctoral research</w:t>
+      </w:r>
+      <w:r>
+        <w:t xml:space="preserve"> </w:t>
+      </w:r>
+      <w:r>
+        <w:t xml:space="preserve">is a scholar who thinks independently under pressure: she does not defer to received</w:t>
+      </w:r>
+      <w:r>
+        <w:t xml:space="preserve"> </w:t>
+      </w:r>
+      <w:r>
+        <w:t xml:space="preserve">frameworks when the evidence pushes elsewhere, and she pursues analytical problems</w:t>
+      </w:r>
+      <w:r>
+        <w:t xml:space="preserve"> </w:t>
+      </w:r>
+      <w:r>
+        <w:t xml:space="preserve">with a persistence and intellectual honesty that is not common at her career stage.</w:t>
+      </w:r>
+      <w:r>
+        <w:t xml:space="preserve"> </w:t>
+      </w:r>
+      <w:r>
+        <w:t xml:space="preserve">What strikes me equally is the depth of her commitment to academic work as a</w:t>
+      </w:r>
+      <w:r>
+        <w:t xml:space="preserve"> </w:t>
+      </w:r>
+      <w:r>
+        <w:t xml:space="preserve">vocation. She has maintained a serious and cumulative research programme across</w:t>
+      </w:r>
+      <w:r>
+        <w:t xml:space="preserve"> </w:t>
+      </w:r>
+      <w:r>
+        <w:t xml:space="preserve">significant institutional transitions and competing demands — that kind of sustained</w:t>
+      </w:r>
+      <w:r>
+        <w:t xml:space="preserve"> </w:t>
+      </w:r>
+      <w:r>
+        <w:t xml:space="preserve">dedication, in my experience, is a more reliable predictor of scholarly achievement</w:t>
+      </w:r>
+      <w:r>
+        <w:t xml:space="preserve"> </w:t>
+      </w:r>
+      <w:r>
+        <w:t xml:space="preserve">than any single paper or result.</w:t>
+      </w:r>
+      <w:r>
+        <w:t xml:space="preserve"> </w:t>
+      </w:r>
+      <w:r>
+        <w:t xml:space="preserve">She is also among the most effective communicators of research I have worked with</w:t>
+      </w:r>
+      <w:r>
+        <w:t xml:space="preserve"> </w:t>
+      </w:r>
+      <w:r>
+        <w:t xml:space="preserve">among junior scholars — precise in her language, alert to her audience, and able to</w:t>
+      </w:r>
+      <w:r>
+        <w:t xml:space="preserve"> </w:t>
+      </w:r>
+      <w:r>
+        <w:t xml:space="preserve">hold the thread of a complex argument across a long seminar discussion. I have had</w:t>
+      </w:r>
+      <w:r>
+        <w:t xml:space="preserve"> </w:t>
+      </w:r>
+      <w:r>
+        <w:t xml:space="preserve">further opportunity to observe these qualities through her role as teaching assistant</w:t>
+      </w:r>
+      <w:r>
+        <w:t xml:space="preserve"> </w:t>
+      </w:r>
+      <w:r>
+        <w:t xml:space="preserve">for my graduate seminar on the frontiers of social development governance at Beijing</w:t>
+      </w:r>
+      <w:r>
+        <w:t xml:space="preserve"> </w:t>
+      </w:r>
+      <w:r>
+        <w:t xml:space="preserve">Normal University. Her involvement went well beyond</w:t>
+      </w:r>
+      <w:r>
+        <w:t xml:space="preserve"> </w:t>
+      </w:r>
+      <w:r>
+        <w:t xml:space="preserve">logistical support: she participated actively in discussion, helped students navigate</w:t>
+      </w:r>
+      <w:r>
+        <w:t xml:space="preserve"> </w:t>
+      </w:r>
+      <w:r>
+        <w:t xml:space="preserve">the intersection of Chinese and international scholarship, and engaged with the</w:t>
+      </w:r>
+      <w:r>
+        <w:t xml:space="preserve"> </w:t>
+      </w:r>
+      <w:r>
+        <w:t xml:space="preserve">material at the level of a collaborator. The bilingual intellectual environment of</w:t>
+      </w:r>
+      <w:r>
+        <w:t xml:space="preserve"> </w:t>
+      </w:r>
+      <w:r>
+        <w:t xml:space="preserve">that seminar is a reasonable approximation of what a researcher at CCCW will face</w:t>
+      </w:r>
+      <w:r>
+        <w:t xml:space="preserve"> </w:t>
+      </w:r>
+      <w:r>
+        <w:t xml:space="preserve">daily — and Mengnan was entirely at home in it.</w:t>
       </w:r>
     </w:p>
     <w:p>

</xml_diff>